<commit_message>
feat(admin): Implement routing and dashboard shell (FE-W-1)
</commit_message>
<xml_diff>
--- a/unified-docs/operations/ELECTA_10-Development_Log.docx
+++ b/unified-docs/operations/ELECTA_10-Development_Log.docx
@@ -4,213 +4,9 @@
   <w:body>
     <w:p>
       <w:r>
-        <w:t>ELECTA - Development Log (v1.4)</w:t>
+        <w:t>ELECTA - Development Log (v1.5) Document Version: 1.5 Date: August 7, 2025 Status: Updated --- Date: July 25, 2025 Sprint: Sprint 0 Summary: Development commenced. Git repositories created. --- Date: July 28, 2025 Sprint: Sprint 0 Summary: Pivoted to a Docker Compose local development strategy, unblocking core development. --- Date: July 30, 2025 Sprint: Sprint 1 Summary: Stabilized the local development environment after extensive troubleshooting of Docker, database, and migration issues. --- Date: August 5, 2025 Sprint: Sprint 1 &amp; 2 (Backend) Summary: Completed all backend development for Sprints 1 and 2, including OTP registration, Admin creation, and the Charter module API/DB schema. Tasks Completed: BE-3.1, BE-3.2, RATE-1, AUDIT-1, DB-2, BE-8, BE-9. --- Date: August 6, 2025 Sprint: Sprint 1, 2, 3 (Android) Summary: Completed all hands-on Android development for the MVP, including UI for Registration, e-KYC, and the Charter module. Tasks Completed: FE-A-2, FE-A-3, FE-A-4, FE-A-5. --- Date: August 7, 2025 (New Entry) Sprint: Sprint 1 (Web Frontend) Summary: Began development of the React Admin Panel. After resolving a series of deep environmental issues with the local Node.js/npm setup, the project was successfully containerized using Docker. Implemented and tested the Admin Login page. Tasks Completed: FE-W-1. Status Change: All major components (Backend, Android, Web Admin) now have a stable, containerized development environment and initial features have been implemented. The project is in a stable state.</w:t>
       </w:r>
     </w:p>
-    <w:p/>
-    <w:p>
-      <w:r>
-        <w:t>Document Version: 1.4</w:t>
-      </w:r>
-    </w:p>
-    <w:p>
-      <w:r>
-        <w:t>Date: August 6, 2025</w:t>
-      </w:r>
-    </w:p>
-    <w:p>
-      <w:r>
-        <w:t>Status: Updated</w:t>
-      </w:r>
-    </w:p>
-    <w:p/>
-    <w:p>
-      <w:r>
-        <w:t>---</w:t>
-      </w:r>
-    </w:p>
-    <w:p>
-      <w:r>
-        <w:t>Date: July 25, 2025</w:t>
-      </w:r>
-    </w:p>
-    <w:p>
-      <w:r>
-        <w:t>Sprint: Sprint 0: Platform Foundation &amp; Setup</w:t>
-      </w:r>
-    </w:p>
-    <w:p>
-      <w:r>
-        <w:t>Summary: The development phase has officially commenced. The initial project setup is underway, with a primary blocker identified.</w:t>
-      </w:r>
-    </w:p>
-    <w:p>
-      <w:r>
-        <w:t>Tasks Completed:</w:t>
-      </w:r>
-    </w:p>
-    <w:p>
-      <w:r>
-        <w:t>- SETUP-1: Git repositories (</w:t>
-      </w:r>
-      <w:proofErr w:type="spellStart"/>
-      <w:r>
-        <w:t>electa</w:t>
-      </w:r>
-      <w:proofErr w:type="spellEnd"/>
-      <w:r>
-        <w:t xml:space="preserve">-backend-api, </w:t>
-      </w:r>
-      <w:proofErr w:type="spellStart"/>
-      <w:r>
-        <w:t>electa</w:t>
-      </w:r>
-      <w:proofErr w:type="spellEnd"/>
-      <w:r>
-        <w:t>-android-app) have been created.</w:t>
-      </w:r>
-    </w:p>
-    <w:p/>
-    <w:p>
-      <w:r>
-        <w:t>---</w:t>
-      </w:r>
-    </w:p>
-    <w:p>
-      <w:r>
-        <w:t>Date: July 28, 2025</w:t>
-      </w:r>
-    </w:p>
-    <w:p>
-      <w:r>
-        <w:t>Sprint: Sprint 0: Platform Foundation &amp; Setup</w:t>
-      </w:r>
-    </w:p>
-    <w:p>
-      <w:r>
-        <w:t>Summary: A major decision was made to pivot the development strategy to unblock progress. The plan to use Docker Compose for a self-contained local development environment is approved.</w:t>
-      </w:r>
-    </w:p>
-    <w:p>
-      <w:r>
-        <w:t>Status Change: Core application development is now UNBLOCKED.</w:t>
-      </w:r>
-    </w:p>
-    <w:p/>
-    <w:p>
-      <w:r>
-        <w:t>---</w:t>
-      </w:r>
-    </w:p>
-    <w:p>
-      <w:r>
-        <w:t>Date: July 30, 2025</w:t>
-      </w:r>
-    </w:p>
-    <w:p>
-      <w:r>
-        <w:t>Sprint: Sprint 1: Core User Registration &amp; Content Creation</w:t>
-      </w:r>
-    </w:p>
-    <w:p>
-      <w:r>
-        <w:t>Summary: Dedicated the session to a deep, hands-on troubleshooting effort to stabilize the local development environment, resolving multiple complex issues related to Docker, database connectivity, and migrations.</w:t>
-      </w:r>
-    </w:p>
-    <w:p>
-      <w:r>
-        <w:t>Status: The local development environment is now stable, and the database schema has been successfully created.</w:t>
-      </w:r>
-    </w:p>
-    <w:p/>
-    <w:p>
-      <w:r>
-        <w:t>---</w:t>
-      </w:r>
-    </w:p>
-    <w:p>
-      <w:r>
-        <w:t>Date: August 5, 2025</w:t>
-      </w:r>
-    </w:p>
-    <w:p>
-      <w:r>
-        <w:t>Sprint: Sprint 1 &amp; 2 (Backend)</w:t>
-      </w:r>
-    </w:p>
-    <w:p>
-      <w:r>
-        <w:t>Summary: Completed the development and successful unit testing of all backend features for Sprints 1 and 2. This includes the OTP registration, Admin content creation, and the full backend API and database schema for the Charter Compliance Module.</w:t>
-      </w:r>
-    </w:p>
-    <w:p>
-      <w:r>
-        <w:t>Tasks Completed:</w:t>
-      </w:r>
-    </w:p>
-    <w:p>
-      <w:r>
-        <w:t>- BE-3.1, BE-3.2, RATE-1, AUDIT-1 (Sprint 1)</w:t>
-      </w:r>
-    </w:p>
-    <w:p>
-      <w:r>
-        <w:lastRenderedPageBreak/>
-        <w:t>- DB-2, BE-8, BE-9 (New Sprint 2)</w:t>
-      </w:r>
-    </w:p>
-    <w:p>
-      <w:r>
-        <w:t>Status: All backend development for Sprints 1 &amp; 2 is complete.</w:t>
-      </w:r>
-    </w:p>
-    <w:p/>
-    <w:p>
-      <w:r>
-        <w:t>---</w:t>
-      </w:r>
-    </w:p>
-    <w:p>
-      <w:r>
-        <w:t>Date: August 6, 2025 (New Entry)</w:t>
-      </w:r>
-    </w:p>
-    <w:p>
-      <w:r>
-        <w:t>Sprint: Sprint 1, 2, 3 (Android)</w:t>
-      </w:r>
-    </w:p>
-    <w:p>
-      <w:r>
-        <w:t>Summary: Completed the guided development and successful end-to-end testing of all planned Android features for Sprints 1, 2, and 3. This includes the full UI and logic for the User Registration, e-KYC placeholder, and the new Charter Module screens. All code has been pushed to the respective repositories.</w:t>
-      </w:r>
-    </w:p>
-    <w:p>
-      <w:r>
-        <w:t>Tasks Completed:</w:t>
-      </w:r>
-    </w:p>
-    <w:p>
-      <w:r>
-        <w:t>- FE-A-2, FE-A-3 (Sprint 1)</w:t>
-      </w:r>
-    </w:p>
-    <w:p>
-      <w:r>
-        <w:t>- FE-A-4 (New Sprint 4)</w:t>
-      </w:r>
-    </w:p>
-    <w:p>
-      <w:r>
-        <w:t>- FE-A-5 (New Sprint 3)</w:t>
-      </w:r>
-    </w:p>
-    <w:p>
-      <w:r>
-        <w:t>Status Change: All planned hands-on feature development for the MVP is now complete. The project is ready for the remaining backend hardening tasks and full integration testing.</w:t>
-      </w:r>
-    </w:p>
-    <w:p/>
     <w:sectPr>
       <w:pgSz w:w="11906" w:h="16838" w:code="9"/>
       <w:pgMar w:top="720" w:right="720" w:bottom="720" w:left="720" w:header="720" w:footer="720" w:gutter="0"/>

</xml_diff>